<commit_message>
cours du 25_03_2026 fin Diagrammes
</commit_message>
<xml_diff>
--- a/Use Case/Prise de Note 2  - Diagramme d'utilisation.docx
+++ b/Use Case/Prise de Note 2  - Diagramme d'utilisation.docx
@@ -2,6 +2,12 @@
 <file path=word/document.xml><?xml version="1.0" encoding="utf-8"?>
 <w:document xmlns:wpc="http://schemas.microsoft.com/office/word/2010/wordprocessingCanvas" xmlns:cx="http://schemas.microsoft.com/office/drawing/2014/chartex" xmlns:mc="http://schemas.openxmlformats.org/markup-compatibility/2006" xmlns:o="urn:schemas-microsoft-com:office:office" xmlns:r="http://schemas.openxmlformats.org/officeDocument/2006/relationships" xmlns:m="http://schemas.openxmlformats.org/officeDocument/2006/math" xmlns:v="urn:schemas-microsoft-com:vml" xmlns:wp14="http://schemas.microsoft.com/office/word/2010/wordprocessingDrawing" xmlns:wp="http://schemas.openxmlformats.org/drawingml/2006/wordprocessingDrawing" xmlns:w10="urn:schemas-microsoft-com:office:word" xmlns:w="http://schemas.openxmlformats.org/wordprocessingml/2006/main" xmlns:w14="http://schemas.microsoft.com/office/word/2010/wordml" xmlns:w15="http://schemas.microsoft.com/office/word/2012/wordml" xmlns:w16se="http://schemas.microsoft.com/office/word/2015/wordml/symex" xmlns:wpg="http://schemas.microsoft.com/office/word/2010/wordprocessingGroup" xmlns:wpi="http://schemas.microsoft.com/office/word/2010/wordprocessingInk" xmlns:wne="http://schemas.microsoft.com/office/word/2006/wordml" xmlns:wps="http://schemas.microsoft.com/office/word/2010/wordprocessingShape" mc:Ignorable="w14 w15 w16se wp14">
   <w:body>
+    <w:p>
+      <w:r>
+        <w:t xml:space="preserve">Diagramme d’Activité </w:t>
+      </w:r>
+    </w:p>
+    <w:p/>
     <w:p>
       <w:r>
         <w:t>Dans l’idéal il faut faire un diagramme d’activité pour chaque activité</w:t>
@@ -174,12 +180,12 @@
     <w:p/>
     <w:p>
       <w:r>
+        <w:lastRenderedPageBreak/>
         <w:t>Attaque par Déni de Service (DDOS)</w:t>
       </w:r>
     </w:p>
     <w:p>
       <w:r>
-        <w:lastRenderedPageBreak/>
         <w:t>On peut mettre un délai de 3s volontaire à chaque tentative de connexion/création de compte pour éviter ça</w:t>
       </w:r>
     </w:p>
@@ -197,6 +203,96 @@
     <w:p>
       <w:r>
         <w:t>User Agent</w:t>
+      </w:r>
+    </w:p>
+    <w:p/>
+    <w:p/>
+    <w:p/>
+    <w:p>
+      <w:r>
+        <w:t>Diagramme de Séquence</w:t>
+      </w:r>
+    </w:p>
+    <w:p>
+      <w:r>
+        <w:t>Dans le Diagramme de Séquence on fait apparaître les erreurs différemment</w:t>
+      </w:r>
+    </w:p>
+    <w:p>
+      <w:r>
+        <w:t>Le cas où tout se passe bien dans le diagramme de séquence est appelé la séquence nominale</w:t>
+      </w:r>
+    </w:p>
+    <w:p>
+      <w:r>
+        <w:t xml:space="preserve">L’étape 8 </w:t>
+      </w:r>
+      <w:r>
+        <w:t>devrait être tout en bas du carré</w:t>
+      </w:r>
+    </w:p>
+    <w:p/>
+    <w:p>
+      <w:r>
+        <w:t>Spécificités</w:t>
+      </w:r>
+    </w:p>
+    <w:p>
+      <w:r>
+        <w:t>Scénario d’erreur : arrêt total de la séquence</w:t>
+      </w:r>
+      <w:r>
+        <w:tab/>
+      </w:r>
+    </w:p>
+    <w:p>
+      <w:r>
+        <w:t>Scénario alternatif : Renvoie vers une étape de la séquence nominale, pas de fin de la séquence</w:t>
+      </w:r>
+    </w:p>
+    <w:p/>
+    <w:p>
+      <w:r>
+        <w:t>On détaille la cause de pourquoi on entre dans le scénario (manquant dans le cours)</w:t>
+      </w:r>
+    </w:p>
+    <w:p>
+      <w:proofErr w:type="spellStart"/>
+      <w:r>
+        <w:t>Async</w:t>
+      </w:r>
+      <w:proofErr w:type="spellEnd"/>
+      <w:r>
+        <w:t xml:space="preserve"> message : Message qui n’attend pas de réponse</w:t>
+      </w:r>
+    </w:p>
+    <w:p/>
+    <w:p>
+      <w:r>
+        <w:t>Si on fait diagramme de séquence et d’activité pour une même activité, vérifier que l</w:t>
+      </w:r>
+      <w:r>
+        <w:t>es deux sont cohérents entre eux</w:t>
+      </w:r>
+    </w:p>
+    <w:p>
+      <w:r>
+        <w:t>Lors de l’écriture des scénarios alternatif, on décrit ce qui permet de retourner dans le scénario nominal</w:t>
+      </w:r>
+    </w:p>
+    <w:p>
+      <w:r>
+        <w:t>On a des scénarios d’erreur dans le diagramme de séquence qui n’existe pas dans le diagramme d’activité</w:t>
+      </w:r>
+    </w:p>
+    <w:p>
+      <w:r>
+        <w:t>Par exemple une flèche du SI vers la BDD peut avoir un scénario d’erreur où la BDD ne renvoie pas de réponse dans un temps impartis.</w:t>
+      </w:r>
+    </w:p>
+    <w:p>
+      <w:r>
+        <w:t>Lors d’un scénario d’erreur on précise le scénario de bon fonctionnement à la fin</w:t>
       </w:r>
       <w:bookmarkStart w:id="0" w:name="_GoBack"/>
       <w:bookmarkEnd w:id="0"/>

</xml_diff>